<commit_message>
Drop Resend from the handover pack
Resend is no longer used (email goes through Google Workspace), so it
shouldn't appear as a key to rotate or a handover step.

Co-Authored-By: Claude Opus 5.5 <noreply@anthropic.com>
Claude-Session: https://claude.ai/code/session_01MJEzdLqYbc1Bh8JQfo6TU3
</commit_message>
<xml_diff>
--- a/docs/handover/Formwork Handover Pack.docx
+++ b/docs/handover/Formwork Handover Pack.docx
@@ -1643,10 +1643,10 @@
         </w:tblBorders>
       </w:tblPr>
       <w:tblGrid>
-        <w:gridCol w:w="1384"/>
-        <w:gridCol w:w="1863"/>
-        <w:gridCol w:w="3194"/>
-        <w:gridCol w:w="3197"/>
+        <w:gridCol w:w="1556"/>
+        <w:gridCol w:w="2095"/>
+        <w:gridCol w:w="2394"/>
+        <w:gridCol w:w="3593"/>
       </w:tblGrid>
       <w:tr>
         <w:trPr>
@@ -1654,7 +1654,7 @@
         </w:trPr>
         <w:tc>
           <w:tcPr>
-            <w:tcW w:type="dxa" w:w="1384"/>
+            <w:tcW w:type="dxa" w:w="1556"/>
             <w:tcBorders>
               <w:top w:val="single" w:color="BFBFBF" w:sz="4"/>
               <w:left w:val="single" w:color="BFBFBF" w:sz="4"/>
@@ -1683,7 +1683,7 @@
         </w:tc>
         <w:tc>
           <w:tcPr>
-            <w:tcW w:type="dxa" w:w="1863"/>
+            <w:tcW w:type="dxa" w:w="2095"/>
             <w:tcBorders>
               <w:top w:val="single" w:color="BFBFBF" w:sz="4"/>
               <w:left w:val="single" w:color="BFBFBF" w:sz="4"/>
@@ -1712,7 +1712,7 @@
         </w:tc>
         <w:tc>
           <w:tcPr>
-            <w:tcW w:type="dxa" w:w="3194"/>
+            <w:tcW w:type="dxa" w:w="2394"/>
             <w:tcBorders>
               <w:top w:val="single" w:color="BFBFBF" w:sz="4"/>
               <w:left w:val="single" w:color="BFBFBF" w:sz="4"/>
@@ -1741,7 +1741,7 @@
         </w:tc>
         <w:tc>
           <w:tcPr>
-            <w:tcW w:type="dxa" w:w="3197"/>
+            <w:tcW w:type="dxa" w:w="3593"/>
             <w:tcBorders>
               <w:top w:val="single" w:color="BFBFBF" w:sz="4"/>
               <w:left w:val="single" w:color="BFBFBF" w:sz="4"/>
@@ -1775,7 +1775,7 @@
         </w:trPr>
         <w:tc>
           <w:tcPr>
-            <w:tcW w:type="dxa" w:w="1384"/>
+            <w:tcW w:type="dxa" w:w="1556"/>
             <w:tcBorders>
               <w:top w:val="single" w:color="BFBFBF" w:sz="4"/>
               <w:left w:val="single" w:color="BFBFBF" w:sz="4"/>
@@ -1802,7 +1802,7 @@
         </w:tc>
         <w:tc>
           <w:tcPr>
-            <w:tcW w:type="dxa" w:w="1863"/>
+            <w:tcW w:type="dxa" w:w="2095"/>
             <w:tcBorders>
               <w:top w:val="single" w:color="BFBFBF" w:sz="4"/>
               <w:left w:val="single" w:color="BFBFBF" w:sz="4"/>
@@ -1828,7 +1828,7 @@
         </w:tc>
         <w:tc>
           <w:tcPr>
-            <w:tcW w:type="dxa" w:w="3194"/>
+            <w:tcW w:type="dxa" w:w="2394"/>
             <w:tcBorders>
               <w:top w:val="single" w:color="BFBFBF" w:sz="4"/>
               <w:left w:val="single" w:color="BFBFBF" w:sz="4"/>
@@ -1854,7 +1854,7 @@
         </w:tc>
         <w:tc>
           <w:tcPr>
-            <w:tcW w:type="dxa" w:w="3197"/>
+            <w:tcW w:type="dxa" w:w="3593"/>
             <w:tcBorders>
               <w:top w:val="single" w:color="BFBFBF" w:sz="4"/>
               <w:left w:val="single" w:color="BFBFBF" w:sz="4"/>
@@ -1885,7 +1885,7 @@
         </w:trPr>
         <w:tc>
           <w:tcPr>
-            <w:tcW w:type="dxa" w:w="1384"/>
+            <w:tcW w:type="dxa" w:w="1556"/>
             <w:tcBorders>
               <w:top w:val="single" w:color="BFBFBF" w:sz="4"/>
               <w:left w:val="single" w:color="BFBFBF" w:sz="4"/>
@@ -1919,7 +1919,7 @@
         </w:tc>
         <w:tc>
           <w:tcPr>
-            <w:tcW w:type="dxa" w:w="1863"/>
+            <w:tcW w:type="dxa" w:w="2095"/>
             <w:tcBorders>
               <w:top w:val="single" w:color="BFBFBF" w:sz="4"/>
               <w:left w:val="single" w:color="BFBFBF" w:sz="4"/>
@@ -1945,7 +1945,7 @@
         </w:tc>
         <w:tc>
           <w:tcPr>
-            <w:tcW w:type="dxa" w:w="3194"/>
+            <w:tcW w:type="dxa" w:w="2394"/>
             <w:tcBorders>
               <w:top w:val="single" w:color="BFBFBF" w:sz="4"/>
               <w:left w:val="single" w:color="BFBFBF" w:sz="4"/>
@@ -1979,7 +1979,7 @@
         </w:tc>
         <w:tc>
           <w:tcPr>
-            <w:tcW w:type="dxa" w:w="3197"/>
+            <w:tcW w:type="dxa" w:w="3593"/>
             <w:tcBorders>
               <w:top w:val="single" w:color="BFBFBF" w:sz="4"/>
               <w:left w:val="single" w:color="BFBFBF" w:sz="4"/>
@@ -2010,7 +2010,7 @@
         </w:trPr>
         <w:tc>
           <w:tcPr>
-            <w:tcW w:type="dxa" w:w="1384"/>
+            <w:tcW w:type="dxa" w:w="1556"/>
             <w:tcBorders>
               <w:top w:val="single" w:color="BFBFBF" w:sz="4"/>
               <w:left w:val="single" w:color="BFBFBF" w:sz="4"/>
@@ -2037,7 +2037,7 @@
         </w:tc>
         <w:tc>
           <w:tcPr>
-            <w:tcW w:type="dxa" w:w="1863"/>
+            <w:tcW w:type="dxa" w:w="2095"/>
             <w:tcBorders>
               <w:top w:val="single" w:color="BFBFBF" w:sz="4"/>
               <w:left w:val="single" w:color="BFBFBF" w:sz="4"/>
@@ -2063,7 +2063,7 @@
         </w:tc>
         <w:tc>
           <w:tcPr>
-            <w:tcW w:type="dxa" w:w="3194"/>
+            <w:tcW w:type="dxa" w:w="2394"/>
             <w:tcBorders>
               <w:top w:val="single" w:color="BFBFBF" w:sz="4"/>
               <w:left w:val="single" w:color="BFBFBF" w:sz="4"/>
@@ -2089,7 +2089,7 @@
         </w:tc>
         <w:tc>
           <w:tcPr>
-            <w:tcW w:type="dxa" w:w="3197"/>
+            <w:tcW w:type="dxa" w:w="3593"/>
             <w:tcBorders>
               <w:top w:val="single" w:color="BFBFBF" w:sz="4"/>
               <w:left w:val="single" w:color="BFBFBF" w:sz="4"/>
@@ -2120,106 +2120,105 @@
         </w:trPr>
         <w:tc>
           <w:tcPr>
-            <w:tcW w:type="dxa" w:w="1384"/>
-            <w:tcBorders>
-              <w:top w:val="single" w:color="BFBFBF" w:sz="4"/>
-              <w:left w:val="single" w:color="BFBFBF" w:sz="4"/>
-              <w:bottom w:val="single" w:color="BFBFBF" w:sz="4"/>
-              <w:right w:val="single" w:color="BFBFBF" w:sz="4"/>
-            </w:tcBorders>
-            <w:tcMar>
-              <w:top w:type="dxa" w:w="60"/>
-              <w:left w:type="dxa" w:w="100"/>
-              <w:bottom w:type="dxa" w:w="60"/>
-              <w:right w:type="dxa" w:w="100"/>
-            </w:tcMar>
-          </w:tcPr>
-          <w:p>
-            <w:r>
-              <w:rPr>
-                <w:rFonts w:ascii="Consolas" w:cs="Consolas" w:eastAsia="Consolas" w:hAnsi="Consolas"/>
-                <w:sz w:val="17"/>
-                <w:szCs w:val="17"/>
-              </w:rPr>
-              <w:t xml:space="preserve">resend_api_key</w:t>
-            </w:r>
-          </w:p>
-        </w:tc>
-        <w:tc>
-          <w:tcPr>
-            <w:tcW w:type="dxa" w:w="1863"/>
-            <w:tcBorders>
-              <w:top w:val="single" w:color="BFBFBF" w:sz="4"/>
-              <w:left w:val="single" w:color="BFBFBF" w:sz="4"/>
-              <w:bottom w:val="single" w:color="BFBFBF" w:sz="4"/>
-              <w:right w:val="single" w:color="BFBFBF" w:sz="4"/>
-            </w:tcBorders>
-            <w:tcMar>
-              <w:top w:type="dxa" w:w="60"/>
-              <w:left w:type="dxa" w:w="100"/>
-              <w:bottom w:type="dxa" w:w="60"/>
-              <w:right w:type="dxa" w:w="100"/>
-            </w:tcMar>
-          </w:tcPr>
-          <w:p>
-            <w:r>
-              <w:rPr>
-                <w:sz w:val="19"/>
-                <w:szCs w:val="19"/>
-              </w:rPr>
-              <w:t xml:space="preserve">Supabase Vault</w:t>
-            </w:r>
-          </w:p>
-        </w:tc>
-        <w:tc>
-          <w:tcPr>
-            <w:tcW w:type="dxa" w:w="3194"/>
-            <w:tcBorders>
-              <w:top w:val="single" w:color="BFBFBF" w:sz="4"/>
-              <w:left w:val="single" w:color="BFBFBF" w:sz="4"/>
-              <w:bottom w:val="single" w:color="BFBFBF" w:sz="4"/>
-              <w:right w:val="single" w:color="BFBFBF" w:sz="4"/>
-            </w:tcBorders>
-            <w:tcMar>
-              <w:top w:type="dxa" w:w="60"/>
-              <w:left w:type="dxa" w:w="100"/>
-              <w:bottom w:type="dxa" w:w="60"/>
-              <w:right w:type="dxa" w:w="100"/>
-            </w:tcMar>
-          </w:tcPr>
-          <w:p>
-            <w:r>
-              <w:rPr>
-                <w:sz w:val="19"/>
-                <w:szCs w:val="19"/>
-              </w:rPr>
-              <w:t xml:space="preserve">Nothing now: email moved to Google Workspace in migration 093</w:t>
-            </w:r>
-          </w:p>
-        </w:tc>
-        <w:tc>
-          <w:tcPr>
-            <w:tcW w:type="dxa" w:w="3197"/>
-            <w:tcBorders>
-              <w:top w:val="single" w:color="BFBFBF" w:sz="4"/>
-              <w:left w:val="single" w:color="BFBFBF" w:sz="4"/>
-              <w:bottom w:val="single" w:color="BFBFBF" w:sz="4"/>
-              <w:right w:val="single" w:color="BFBFBF" w:sz="4"/>
-            </w:tcBorders>
-            <w:tcMar>
-              <w:top w:type="dxa" w:w="60"/>
-              <w:left w:type="dxa" w:w="100"/>
-              <w:bottom w:type="dxa" w:w="60"/>
-              <w:right w:type="dxa" w:w="100"/>
-            </w:tcMar>
-          </w:tcPr>
-          <w:p>
-            <w:r>
-              <w:rPr>
-                <w:sz w:val="19"/>
-                <w:szCs w:val="19"/>
-              </w:rPr>
-              <w:t xml:space="preserve">Revoke at Resend and delete it from the Vault</w:t>
+            <w:tcW w:type="dxa" w:w="1556"/>
+            <w:tcBorders>
+              <w:top w:val="single" w:color="BFBFBF" w:sz="4"/>
+              <w:left w:val="single" w:color="BFBFBF" w:sz="4"/>
+              <w:bottom w:val="single" w:color="BFBFBF" w:sz="4"/>
+              <w:right w:val="single" w:color="BFBFBF" w:sz="4"/>
+            </w:tcBorders>
+            <w:tcMar>
+              <w:top w:type="dxa" w:w="60"/>
+              <w:left w:type="dxa" w:w="100"/>
+              <w:bottom w:type="dxa" w:w="60"/>
+              <w:right w:type="dxa" w:w="100"/>
+            </w:tcMar>
+          </w:tcPr>
+          <w:p>
+            <w:r>
+              <w:rPr>
+                <w:sz w:val="19"/>
+                <w:szCs w:val="19"/>
+              </w:rPr>
+              <w:t xml:space="preserve">Supabase database password</w:t>
+            </w:r>
+          </w:p>
+        </w:tc>
+        <w:tc>
+          <w:tcPr>
+            <w:tcW w:type="dxa" w:w="2095"/>
+            <w:tcBorders>
+              <w:top w:val="single" w:color="BFBFBF" w:sz="4"/>
+              <w:left w:val="single" w:color="BFBFBF" w:sz="4"/>
+              <w:bottom w:val="single" w:color="BFBFBF" w:sz="4"/>
+              <w:right w:val="single" w:color="BFBFBF" w:sz="4"/>
+            </w:tcBorders>
+            <w:tcMar>
+              <w:top w:type="dxa" w:w="60"/>
+              <w:left w:type="dxa" w:w="100"/>
+              <w:bottom w:type="dxa" w:w="60"/>
+              <w:right w:type="dxa" w:w="100"/>
+            </w:tcMar>
+          </w:tcPr>
+          <w:p>
+            <w:r>
+              <w:rPr>
+                <w:sz w:val="19"/>
+                <w:szCs w:val="19"/>
+              </w:rPr>
+              <w:t xml:space="preserve">Supabase → Database settings</w:t>
+            </w:r>
+          </w:p>
+        </w:tc>
+        <w:tc>
+          <w:tcPr>
+            <w:tcW w:type="dxa" w:w="2394"/>
+            <w:tcBorders>
+              <w:top w:val="single" w:color="BFBFBF" w:sz="4"/>
+              <w:left w:val="single" w:color="BFBFBF" w:sz="4"/>
+              <w:bottom w:val="single" w:color="BFBFBF" w:sz="4"/>
+              <w:right w:val="single" w:color="BFBFBF" w:sz="4"/>
+            </w:tcBorders>
+            <w:tcMar>
+              <w:top w:type="dxa" w:w="60"/>
+              <w:left w:type="dxa" w:w="100"/>
+              <w:bottom w:type="dxa" w:w="60"/>
+              <w:right w:type="dxa" w:w="100"/>
+            </w:tcMar>
+          </w:tcPr>
+          <w:p>
+            <w:r>
+              <w:rPr>
+                <w:sz w:val="19"/>
+                <w:szCs w:val="19"/>
+              </w:rPr>
+              <w:t xml:space="preserve">Direct database access only</w:t>
+            </w:r>
+          </w:p>
+        </w:tc>
+        <w:tc>
+          <w:tcPr>
+            <w:tcW w:type="dxa" w:w="3593"/>
+            <w:tcBorders>
+              <w:top w:val="single" w:color="BFBFBF" w:sz="4"/>
+              <w:left w:val="single" w:color="BFBFBF" w:sz="4"/>
+              <w:bottom w:val="single" w:color="BFBFBF" w:sz="4"/>
+              <w:right w:val="single" w:color="BFBFBF" w:sz="4"/>
+            </w:tcBorders>
+            <w:tcMar>
+              <w:top w:type="dxa" w:w="60"/>
+              <w:left w:type="dxa" w:w="100"/>
+              <w:bottom w:type="dxa" w:w="60"/>
+              <w:right w:type="dxa" w:w="100"/>
+            </w:tcMar>
+          </w:tcPr>
+          <w:p>
+            <w:r>
+              <w:rPr>
+                <w:sz w:val="19"/>
+                <w:szCs w:val="19"/>
+              </w:rPr>
+              <w:t xml:space="preserve">Reset after transfer</w:t>
             </w:r>
           </w:p>
         </w:tc>
@@ -2230,116 +2229,7 @@
         </w:trPr>
         <w:tc>
           <w:tcPr>
-            <w:tcW w:type="dxa" w:w="1384"/>
-            <w:tcBorders>
-              <w:top w:val="single" w:color="BFBFBF" w:sz="4"/>
-              <w:left w:val="single" w:color="BFBFBF" w:sz="4"/>
-              <w:bottom w:val="single" w:color="BFBFBF" w:sz="4"/>
-              <w:right w:val="single" w:color="BFBFBF" w:sz="4"/>
-            </w:tcBorders>
-            <w:tcMar>
-              <w:top w:type="dxa" w:w="60"/>
-              <w:left w:type="dxa" w:w="100"/>
-              <w:bottom w:type="dxa" w:w="60"/>
-              <w:right w:type="dxa" w:w="100"/>
-            </w:tcMar>
-          </w:tcPr>
-          <w:p>
-            <w:r>
-              <w:rPr>
-                <w:sz w:val="19"/>
-                <w:szCs w:val="19"/>
-              </w:rPr>
-              <w:t xml:space="preserve">Supabase database password</w:t>
-            </w:r>
-          </w:p>
-        </w:tc>
-        <w:tc>
-          <w:tcPr>
-            <w:tcW w:type="dxa" w:w="1863"/>
-            <w:tcBorders>
-              <w:top w:val="single" w:color="BFBFBF" w:sz="4"/>
-              <w:left w:val="single" w:color="BFBFBF" w:sz="4"/>
-              <w:bottom w:val="single" w:color="BFBFBF" w:sz="4"/>
-              <w:right w:val="single" w:color="BFBFBF" w:sz="4"/>
-            </w:tcBorders>
-            <w:tcMar>
-              <w:top w:type="dxa" w:w="60"/>
-              <w:left w:type="dxa" w:w="100"/>
-              <w:bottom w:type="dxa" w:w="60"/>
-              <w:right w:type="dxa" w:w="100"/>
-            </w:tcMar>
-          </w:tcPr>
-          <w:p>
-            <w:r>
-              <w:rPr>
-                <w:sz w:val="19"/>
-                <w:szCs w:val="19"/>
-              </w:rPr>
-              <w:t xml:space="preserve">Supabase → Database settings</w:t>
-            </w:r>
-          </w:p>
-        </w:tc>
-        <w:tc>
-          <w:tcPr>
-            <w:tcW w:type="dxa" w:w="3194"/>
-            <w:tcBorders>
-              <w:top w:val="single" w:color="BFBFBF" w:sz="4"/>
-              <w:left w:val="single" w:color="BFBFBF" w:sz="4"/>
-              <w:bottom w:val="single" w:color="BFBFBF" w:sz="4"/>
-              <w:right w:val="single" w:color="BFBFBF" w:sz="4"/>
-            </w:tcBorders>
-            <w:tcMar>
-              <w:top w:type="dxa" w:w="60"/>
-              <w:left w:type="dxa" w:w="100"/>
-              <w:bottom w:type="dxa" w:w="60"/>
-              <w:right w:type="dxa" w:w="100"/>
-            </w:tcMar>
-          </w:tcPr>
-          <w:p>
-            <w:r>
-              <w:rPr>
-                <w:sz w:val="19"/>
-                <w:szCs w:val="19"/>
-              </w:rPr>
-              <w:t xml:space="preserve">Direct database access only</w:t>
-            </w:r>
-          </w:p>
-        </w:tc>
-        <w:tc>
-          <w:tcPr>
-            <w:tcW w:type="dxa" w:w="3197"/>
-            <w:tcBorders>
-              <w:top w:val="single" w:color="BFBFBF" w:sz="4"/>
-              <w:left w:val="single" w:color="BFBFBF" w:sz="4"/>
-              <w:bottom w:val="single" w:color="BFBFBF" w:sz="4"/>
-              <w:right w:val="single" w:color="BFBFBF" w:sz="4"/>
-            </w:tcBorders>
-            <w:tcMar>
-              <w:top w:type="dxa" w:w="60"/>
-              <w:left w:type="dxa" w:w="100"/>
-              <w:bottom w:type="dxa" w:w="60"/>
-              <w:right w:type="dxa" w:w="100"/>
-            </w:tcMar>
-          </w:tcPr>
-          <w:p>
-            <w:r>
-              <w:rPr>
-                <w:sz w:val="19"/>
-                <w:szCs w:val="19"/>
-              </w:rPr>
-              <w:t xml:space="preserve">Reset after transfer</w:t>
-            </w:r>
-          </w:p>
-        </w:tc>
-      </w:tr>
-      <w:tr>
-        <w:trPr>
-          <w:tblHeader w:val="false"/>
-        </w:trPr>
-        <w:tc>
-          <w:tcPr>
-            <w:tcW w:type="dxa" w:w="1384"/>
+            <w:tcW w:type="dxa" w:w="1556"/>
             <w:tcBorders>
               <w:top w:val="single" w:color="BFBFBF" w:sz="4"/>
               <w:left w:val="single" w:color="BFBFBF" w:sz="4"/>
@@ -2365,7 +2255,7 @@
         </w:tc>
         <w:tc>
           <w:tcPr>
-            <w:tcW w:type="dxa" w:w="1863"/>
+            <w:tcW w:type="dxa" w:w="2095"/>
             <w:tcBorders>
               <w:top w:val="single" w:color="BFBFBF" w:sz="4"/>
               <w:left w:val="single" w:color="BFBFBF" w:sz="4"/>
@@ -2399,7 +2289,7 @@
         </w:tc>
         <w:tc>
           <w:tcPr>
-            <w:tcW w:type="dxa" w:w="3194"/>
+            <w:tcW w:type="dxa" w:w="2394"/>
             <w:tcBorders>
               <w:top w:val="single" w:color="BFBFBF" w:sz="4"/>
               <w:left w:val="single" w:color="BFBFBF" w:sz="4"/>
@@ -2425,7 +2315,7 @@
         </w:tc>
         <w:tc>
           <w:tcPr>
-            <w:tcW w:type="dxa" w:w="3197"/>
+            <w:tcW w:type="dxa" w:w="3593"/>
             <w:tcBorders>
               <w:top w:val="single" w:color="BFBFBF" w:sz="4"/>
               <w:left w:val="single" w:color="BFBFBF" w:sz="4"/>
@@ -4987,7 +4877,7 @@
               </w:rPr>
               <w:t xml:space="preserve">Free plan has no backups and pauses after 7 days with no activity. Pro adds daily backups kept for 7 days. </w:t>
             </w:r>
-            <w:hyperlink w:history="1" r:id="rIdw52rf6bon-ebf1f6pjqh9">
+            <w:hyperlink w:history="1" r:id="rIdqbnfksa7goovct5rjdlwb">
               <w:r>
                 <w:rPr>
                   <w:rStyle w:val="Hyperlink"/>
@@ -5106,7 +4996,7 @@
               </w:rPr>
               <w:t xml:space="preserve">The free Hobby plan is for personal, non-commercial use only; a school system needs Pro. </w:t>
             </w:r>
-            <w:hyperlink w:history="1" r:id="rIdt1o8fy1qozz_apnrssstj">
+            <w:hyperlink w:history="1" r:id="rIdk7lcrqrjb0rvydt61oprd">
               <w:r>
                 <w:rPr>
                   <w:rStyle w:val="Hyperlink"/>
@@ -5233,7 +5123,7 @@
               </w:rPr>
               <w:t xml:space="preserve">Renewal prices vary widely by registrar; check the current registrar's renewal price. </w:t>
             </w:r>
-            <w:hyperlink w:history="1" r:id="rIdwwoqcreiwuuiysg8p8g5p">
+            <w:hyperlink w:history="1" r:id="rIdvlx0jakn7ea6qmyiilk67">
               <w:r>
                 <w:rPr>
                   <w:rStyle w:val="Hyperlink"/>
@@ -5476,7 +5366,7 @@
               </w:rPr>
               <w:t xml:space="preserve">Only one mailbox is needed. </w:t>
             </w:r>
-            <w:hyperlink w:history="1" r:id="rIdjrzwb2ltelqkharggikro">
+            <w:hyperlink w:history="1" r:id="rIdvbskewimxtxkpia_dvmla">
               <w:r>
                 <w:rPr>
                   <w:rStyle w:val="Hyperlink"/>
@@ -5805,29 +5695,6 @@
       </w:r>
       <w:r>
         <w:t xml:space="preserve"> in Vercel from a school account</w:t>
-      </w:r>
-    </w:p>
-    <w:p>
-      <w:pPr>
-        <w:pStyle w:val="ListParagraph"/>
-        <w:numPr>
-          <w:ilvl w:val="0"/>
-          <w:numId w:val="3"/>
-        </w:numPr>
-      </w:pPr>
-      <w:r>
-        <w:t xml:space="preserve">Revoke the old Resend key and delete </w:t>
-      </w:r>
-      <w:r>
-        <w:rPr>
-          <w:rFonts w:ascii="Consolas" w:cs="Consolas" w:eastAsia="Consolas" w:hAnsi="Consolas"/>
-          <w:sz w:val="20"/>
-          <w:szCs w:val="20"/>
-        </w:rPr>
-        <w:t xml:space="preserve">resend_api_key</w:t>
-      </w:r>
-      <w:r>
-        <w:t xml:space="preserve"> from the Vault</w:t>
       </w:r>
     </w:p>
     <w:p>

</xml_diff>

<commit_message>
Remove Claude references from the handover pack
Co-Authored-By: Claude Opus 5.5 <noreply@anthropic.com>
Claude-Session: https://claude.ai/code/session_01MJEzdLqYbc1Bh8JQfo6TU3
</commit_message>
<xml_diff>
--- a/docs/handover/Formwork Handover Pack.docx
+++ b/docs/handover/Formwork Handover Pack.docx
@@ -4877,7 +4877,7 @@
               </w:rPr>
               <w:t xml:space="preserve">Free plan has no backups and pauses after 7 days with no activity. Pro adds daily backups kept for 7 days. </w:t>
             </w:r>
-            <w:hyperlink w:history="1" r:id="rIdqbnfksa7goovct5rjdlwb">
+            <w:hyperlink w:history="1" r:id="rIdkfqw02taenexiasxbwo0x">
               <w:r>
                 <w:rPr>
                   <w:rStyle w:val="Hyperlink"/>
@@ -4996,7 +4996,7 @@
               </w:rPr>
               <w:t xml:space="preserve">The free Hobby plan is for personal, non-commercial use only; a school system needs Pro. </w:t>
             </w:r>
-            <w:hyperlink w:history="1" r:id="rIdk7lcrqrjb0rvydt61oprd">
+            <w:hyperlink w:history="1" r:id="rId1kqevef6b5xv_18eigzxu">
               <w:r>
                 <w:rPr>
                   <w:rStyle w:val="Hyperlink"/>
@@ -5123,7 +5123,7 @@
               </w:rPr>
               <w:t xml:space="preserve">Renewal prices vary widely by registrar; check the current registrar's renewal price. </w:t>
             </w:r>
-            <w:hyperlink w:history="1" r:id="rIdvlx0jakn7ea6qmyiilk67">
+            <w:hyperlink w:history="1" r:id="rId4xny1brk9xopyupyrwctt">
               <w:r>
                 <w:rPr>
                   <w:rStyle w:val="Hyperlink"/>
@@ -5240,7 +5240,7 @@
                 <w:sz w:val="19"/>
                 <w:szCs w:val="19"/>
               </w:rPr>
-              <w:t xml:space="preserve">Uses Claude Sonnet 5 at 2 per million input tokens and 10 per million output tokens. Around 8,000 comments a year works out at about 50 a year</w:t>
+              <w:t xml:space="preserve">Charged at 2 per million input tokens and 10 per million output tokens. Around 8,000 comments a year works out at about 50 a year</w:t>
             </w:r>
           </w:p>
         </w:tc>
@@ -5366,7 +5366,7 @@
               </w:rPr>
               <w:t xml:space="preserve">Only one mailbox is needed. </w:t>
             </w:r>
-            <w:hyperlink w:history="1" r:id="rIdvbskewimxtxkpia_dvmla">
+            <w:hyperlink w:history="1" r:id="rIdpd-bdnwe5_oyyv0jsmozw">
               <w:r>
                 <w:rPr>
                   <w:rStyle w:val="Hyperlink"/>
@@ -5763,17 +5763,6 @@
           <w:szCs w:val="20"/>
         </w:rPr>
         <w:t xml:space="preserve">sql/CURRENT_SCHEMA.md</w:t>
-      </w:r>
-      <w:r>
-        <w:t xml:space="preserve">, </w:t>
-      </w:r>
-      <w:r>
-        <w:rPr>
-          <w:rFonts w:ascii="Consolas" w:cs="Consolas" w:eastAsia="Consolas" w:hAnsi="Consolas"/>
-          <w:sz w:val="20"/>
-          <w:szCs w:val="20"/>
-        </w:rPr>
-        <w:t xml:space="preserve">CLAUDE.md</w:t>
       </w:r>
       <w:r>
         <w:t xml:space="preserve"> and </w:t>

</xml_diff>

<commit_message>
Name the AI supplier generically and explain the comment helper
Replaces the supplier name with "AI provider" and adds a section on
what the report comment helper does, what data it sends and why the
school should record it as a data processor.

Co-Authored-By: Claude Opus 5.5 <noreply@anthropic.com>
Claude-Session: https://claude.ai/code/session_01MJEzdLqYbc1Bh8JQfo6TU3
</commit_message>
<xml_diff>
--- a/docs/handover/Formwork Handover Pack.docx
+++ b/docs/handover/Formwork Handover Pack.docx
@@ -614,7 +614,7 @@
                 <w:sz w:val="19"/>
                 <w:szCs w:val="19"/>
               </w:rPr>
-              <w:t xml:space="preserve">Anthropic API, paid per use</w:t>
+              <w:t xml:space="preserve">An outside AI provider, paid per use (see The AI report comment helper)</w:t>
             </w:r>
           </w:p>
         </w:tc>
@@ -1382,7 +1382,7 @@
                 <w:sz w:val="19"/>
                 <w:szCs w:val="19"/>
               </w:rPr>
-              <w:t xml:space="preserve">Anthropic</w:t>
+              <w:t xml:space="preserve">AI provider</w:t>
             </w:r>
           </w:p>
         </w:tc>
@@ -1434,7 +1434,7 @@
                 <w:sz w:val="19"/>
                 <w:szCs w:val="19"/>
               </w:rPr>
-              <w:t xml:space="preserve">A school Anthropic account</w:t>
+              <w:t xml:space="preserve">A school account with the AI provider</w:t>
             </w:r>
           </w:p>
         </w:tc>
@@ -1460,22 +1460,7 @@
                 <w:sz w:val="19"/>
                 <w:szCs w:val="19"/>
               </w:rPr>
-              <w:t xml:space="preserve">Create a new key; replace </w:t>
-            </w:r>
-            <w:r>
-              <w:rPr>
-                <w:rFonts w:ascii="Consolas" w:cs="Consolas" w:eastAsia="Consolas" w:hAnsi="Consolas"/>
-                <w:sz w:val="17"/>
-                <w:szCs w:val="17"/>
-              </w:rPr>
-              <w:t xml:space="preserve">ANTHROPIC_API_KEY</w:t>
-            </w:r>
-            <w:r>
-              <w:rPr>
-                <w:sz w:val="19"/>
-                <w:szCs w:val="19"/>
-              </w:rPr>
-              <w:t xml:space="preserve"> in Vercel</w:t>
+              <w:t xml:space="preserve">Create a new API key and replace the old one in Vercel's environment variables</w:t>
             </w:r>
           </w:p>
         </w:tc>
@@ -2027,11 +2012,10 @@
           <w:p>
             <w:r>
               <w:rPr>
-                <w:rFonts w:ascii="Consolas" w:cs="Consolas" w:eastAsia="Consolas" w:hAnsi="Consolas"/>
-                <w:sz w:val="17"/>
-                <w:szCs w:val="17"/>
-              </w:rPr>
-              <w:t xml:space="preserve">ANTHROPIC_API_KEY</w:t>
+                <w:sz w:val="19"/>
+                <w:szCs w:val="19"/>
+              </w:rPr>
+              <w:t xml:space="preserve">AI provider API key</w:t>
             </w:r>
           </w:p>
         </w:tc>
@@ -2109,7 +2093,7 @@
                 <w:sz w:val="19"/>
                 <w:szCs w:val="19"/>
               </w:rPr>
-              <w:t xml:space="preserve">New key from the school's Anthropic account</w:t>
+              <w:t xml:space="preserve">New key from the school's AI provider account</w:t>
             </w:r>
           </w:p>
         </w:tc>
@@ -2979,6 +2963,420 @@
       </w:r>
       <w:r>
         <w:t xml:space="preserve"> A made-up negative behaviour event will email the senior team. Test in a separate Supabase project instead.</w:t>
+      </w:r>
+    </w:p>
+    <w:p>
+      <w:pPr>
+        <w:pStyle w:val="Heading1"/>
+      </w:pPr>
+      <w:r>
+        <w:t xml:space="preserve">The AI report comment helper</w:t>
+      </w:r>
+    </w:p>
+    <w:p>
+      <w:pPr>
+        <w:spacing w:after="160"/>
+      </w:pPr>
+      <w:r>
+        <w:t xml:space="preserve">Formwork uses an outside AI provider in two places, both in report writing. It only runs when a member of staff presses the button; nothing is sent automatically.</w:t>
+      </w:r>
+    </w:p>
+    <w:tbl>
+      <w:tblPr>
+        <w:tblW w:type="dxa" w:w="9638"/>
+        <w:tblBorders>
+          <w:top w:val="single" w:color="auto" w:sz="4"/>
+          <w:left w:val="single" w:color="auto" w:sz="4"/>
+          <w:bottom w:val="single" w:color="auto" w:sz="4"/>
+          <w:right w:val="single" w:color="auto" w:sz="4"/>
+          <w:insideH w:val="single" w:color="auto" w:sz="4"/>
+          <w:insideV w:val="single" w:color="auto" w:sz="4"/>
+        </w:tblBorders>
+      </w:tblPr>
+      <w:tblGrid>
+        <w:gridCol w:w="3212"/>
+        <w:gridCol w:w="3212"/>
+        <w:gridCol w:w="3214"/>
+      </w:tblGrid>
+      <w:tr>
+        <w:trPr>
+          <w:tblHeader/>
+        </w:trPr>
+        <w:tc>
+          <w:tcPr>
+            <w:tcW w:type="dxa" w:w="3212"/>
+            <w:tcBorders>
+              <w:top w:val="single" w:color="BFBFBF" w:sz="4"/>
+              <w:left w:val="single" w:color="BFBFBF" w:sz="4"/>
+              <w:bottom w:val="single" w:color="BFBFBF" w:sz="4"/>
+              <w:right w:val="single" w:color="BFBFBF" w:sz="4"/>
+            </w:tcBorders>
+            <w:shd w:fill="E8EEF4" w:color="auto" w:val="clear"/>
+            <w:tcMar>
+              <w:top w:type="dxa" w:w="60"/>
+              <w:left w:type="dxa" w:w="100"/>
+              <w:bottom w:type="dxa" w:w="60"/>
+              <w:right w:type="dxa" w:w="100"/>
+            </w:tcMar>
+          </w:tcPr>
+          <w:p>
+            <w:r>
+              <w:rPr>
+                <w:b/>
+                <w:bCs/>
+                <w:sz w:val="19"/>
+                <w:szCs w:val="19"/>
+              </w:rPr>
+              <w:t xml:space="preserve">Where</w:t>
+            </w:r>
+          </w:p>
+        </w:tc>
+        <w:tc>
+          <w:tcPr>
+            <w:tcW w:type="dxa" w:w="3212"/>
+            <w:tcBorders>
+              <w:top w:val="single" w:color="BFBFBF" w:sz="4"/>
+              <w:left w:val="single" w:color="BFBFBF" w:sz="4"/>
+              <w:bottom w:val="single" w:color="BFBFBF" w:sz="4"/>
+              <w:right w:val="single" w:color="BFBFBF" w:sz="4"/>
+            </w:tcBorders>
+            <w:shd w:fill="E8EEF4" w:color="auto" w:val="clear"/>
+            <w:tcMar>
+              <w:top w:type="dxa" w:w="60"/>
+              <w:left w:type="dxa" w:w="100"/>
+              <w:bottom w:type="dxa" w:w="60"/>
+              <w:right w:type="dxa" w:w="100"/>
+            </w:tcMar>
+          </w:tcPr>
+          <w:p>
+            <w:r>
+              <w:rPr>
+                <w:b/>
+                <w:bCs/>
+                <w:sz w:val="19"/>
+                <w:szCs w:val="19"/>
+              </w:rPr>
+              <w:t xml:space="preserve">What it does</w:t>
+            </w:r>
+          </w:p>
+        </w:tc>
+        <w:tc>
+          <w:tcPr>
+            <w:tcW w:type="dxa" w:w="3214"/>
+            <w:tcBorders>
+              <w:top w:val="single" w:color="BFBFBF" w:sz="4"/>
+              <w:left w:val="single" w:color="BFBFBF" w:sz="4"/>
+              <w:bottom w:val="single" w:color="BFBFBF" w:sz="4"/>
+              <w:right w:val="single" w:color="BFBFBF" w:sz="4"/>
+            </w:tcBorders>
+            <w:shd w:fill="E8EEF4" w:color="auto" w:val="clear"/>
+            <w:tcMar>
+              <w:top w:type="dxa" w:w="60"/>
+              <w:left w:type="dxa" w:w="100"/>
+              <w:bottom w:type="dxa" w:w="60"/>
+              <w:right w:type="dxa" w:w="100"/>
+            </w:tcMar>
+          </w:tcPr>
+          <w:p>
+            <w:r>
+              <w:rPr>
+                <w:b/>
+                <w:bCs/>
+                <w:sz w:val="19"/>
+                <w:szCs w:val="19"/>
+              </w:rPr>
+              <w:t xml:space="preserve">What is sent to the AI provider</w:t>
+            </w:r>
+          </w:p>
+        </w:tc>
+      </w:tr>
+      <w:tr>
+        <w:trPr>
+          <w:tblHeader w:val="false"/>
+        </w:trPr>
+        <w:tc>
+          <w:tcPr>
+            <w:tcW w:type="dxa" w:w="3212"/>
+            <w:tcBorders>
+              <w:top w:val="single" w:color="BFBFBF" w:sz="4"/>
+              <w:left w:val="single" w:color="BFBFBF" w:sz="4"/>
+              <w:bottom w:val="single" w:color="BFBFBF" w:sz="4"/>
+              <w:right w:val="single" w:color="BFBFBF" w:sz="4"/>
+            </w:tcBorders>
+            <w:tcMar>
+              <w:top w:type="dxa" w:w="60"/>
+              <w:left w:type="dxa" w:w="100"/>
+              <w:bottom w:type="dxa" w:w="60"/>
+              <w:right w:type="dxa" w:w="100"/>
+            </w:tcMar>
+          </w:tcPr>
+          <w:p>
+            <w:r>
+              <w:rPr>
+                <w:sz w:val="19"/>
+                <w:szCs w:val="19"/>
+              </w:rPr>
+              <w:t xml:space="preserve">Write Subject Comments (</w:t>
+            </w:r>
+            <w:r>
+              <w:rPr>
+                <w:rFonts w:ascii="Consolas" w:cs="Consolas" w:eastAsia="Consolas" w:hAnsi="Consolas"/>
+                <w:sz w:val="17"/>
+                <w:szCs w:val="17"/>
+              </w:rPr>
+              <w:t xml:space="preserve">/reports/write-subject-comments</w:t>
+            </w:r>
+            <w:r>
+              <w:rPr>
+                <w:sz w:val="19"/>
+                <w:szCs w:val="19"/>
+              </w:rPr>
+              <w:t xml:space="preserve">), draft button</w:t>
+            </w:r>
+          </w:p>
+        </w:tc>
+        <w:tc>
+          <w:tcPr>
+            <w:tcW w:type="dxa" w:w="3212"/>
+            <w:tcBorders>
+              <w:top w:val="single" w:color="BFBFBF" w:sz="4"/>
+              <w:left w:val="single" w:color="BFBFBF" w:sz="4"/>
+              <w:bottom w:val="single" w:color="BFBFBF" w:sz="4"/>
+              <w:right w:val="single" w:color="BFBFBF" w:sz="4"/>
+            </w:tcBorders>
+            <w:tcMar>
+              <w:top w:type="dxa" w:w="60"/>
+              <w:left w:type="dxa" w:w="100"/>
+              <w:bottom w:type="dxa" w:w="60"/>
+              <w:right w:type="dxa" w:w="100"/>
+            </w:tcMar>
+          </w:tcPr>
+          <w:p>
+            <w:r>
+              <w:rPr>
+                <w:sz w:val="19"/>
+                <w:szCs w:val="19"/>
+              </w:rPr>
+              <w:t xml:space="preserve">Writes a 2–3 sentence draft comment into the teacher's comment box</w:t>
+            </w:r>
+          </w:p>
+        </w:tc>
+        <w:tc>
+          <w:tcPr>
+            <w:tcW w:type="dxa" w:w="3214"/>
+            <w:tcBorders>
+              <w:top w:val="single" w:color="BFBFBF" w:sz="4"/>
+              <w:left w:val="single" w:color="BFBFBF" w:sz="4"/>
+              <w:bottom w:val="single" w:color="BFBFBF" w:sz="4"/>
+              <w:right w:val="single" w:color="BFBFBF" w:sz="4"/>
+            </w:tcBorders>
+            <w:tcMar>
+              <w:top w:type="dxa" w:w="60"/>
+              <w:left w:type="dxa" w:w="100"/>
+              <w:bottom w:type="dxa" w:w="60"/>
+              <w:right w:type="dxa" w:w="100"/>
+            </w:tcMar>
+          </w:tcPr>
+          <w:p>
+            <w:r>
+              <w:rPr>
+                <w:sz w:val="19"/>
+                <w:szCs w:val="19"/>
+              </w:rPr>
+              <w:t xml:space="preserve">The student's first name, the subject, effort grade, latest result, target grade and any notes the teacher has already typed</w:t>
+            </w:r>
+          </w:p>
+        </w:tc>
+      </w:tr>
+      <w:tr>
+        <w:trPr>
+          <w:tblHeader w:val="false"/>
+        </w:trPr>
+        <w:tc>
+          <w:tcPr>
+            <w:tcW w:type="dxa" w:w="3212"/>
+            <w:tcBorders>
+              <w:top w:val="single" w:color="BFBFBF" w:sz="4"/>
+              <w:left w:val="single" w:color="BFBFBF" w:sz="4"/>
+              <w:bottom w:val="single" w:color="BFBFBF" w:sz="4"/>
+              <w:right w:val="single" w:color="BFBFBF" w:sz="4"/>
+            </w:tcBorders>
+            <w:tcMar>
+              <w:top w:type="dxa" w:w="60"/>
+              <w:left w:type="dxa" w:w="100"/>
+              <w:bottom w:type="dxa" w:w="60"/>
+              <w:right w:type="dxa" w:w="100"/>
+            </w:tcMar>
+          </w:tcPr>
+          <w:p>
+            <w:r>
+              <w:rPr>
+                <w:sz w:val="19"/>
+                <w:szCs w:val="19"/>
+              </w:rPr>
+              <w:t xml:space="preserve">Check Reports (</w:t>
+            </w:r>
+            <w:r>
+              <w:rPr>
+                <w:rFonts w:ascii="Consolas" w:cs="Consolas" w:eastAsia="Consolas" w:hAnsi="Consolas"/>
+                <w:sz w:val="17"/>
+                <w:szCs w:val="17"/>
+              </w:rPr>
+              <w:t xml:space="preserve">/reports/check</w:t>
+            </w:r>
+            <w:r>
+              <w:rPr>
+                <w:sz w:val="19"/>
+                <w:szCs w:val="19"/>
+              </w:rPr>
+              <w:t xml:space="preserve">), </w:t>
+            </w:r>
+            <w:r>
+              <w:rPr>
+                <w:sz w:val="19"/>
+                <w:szCs w:val="19"/>
+              </w:rPr>
+              <w:t xml:space="preserve">Run AI check</w:t>
+            </w:r>
+          </w:p>
+        </w:tc>
+        <w:tc>
+          <w:tcPr>
+            <w:tcW w:type="dxa" w:w="3212"/>
+            <w:tcBorders>
+              <w:top w:val="single" w:color="BFBFBF" w:sz="4"/>
+              <w:left w:val="single" w:color="BFBFBF" w:sz="4"/>
+              <w:bottom w:val="single" w:color="BFBFBF" w:sz="4"/>
+              <w:right w:val="single" w:color="BFBFBF" w:sz="4"/>
+            </w:tcBorders>
+            <w:tcMar>
+              <w:top w:type="dxa" w:w="60"/>
+              <w:left w:type="dxa" w:w="100"/>
+              <w:bottom w:type="dxa" w:w="60"/>
+              <w:right w:type="dxa" w:w="100"/>
+            </w:tcMar>
+          </w:tcPr>
+          <w:p>
+            <w:r>
+              <w:rPr>
+                <w:sz w:val="19"/>
+                <w:szCs w:val="19"/>
+              </w:rPr>
+              <w:t xml:space="preserve">Flags spelling, grammar and tone problems, and comments that don't match the student's results; offers a corrected version for small fixes</w:t>
+            </w:r>
+          </w:p>
+        </w:tc>
+        <w:tc>
+          <w:tcPr>
+            <w:tcW w:type="dxa" w:w="3214"/>
+            <w:tcBorders>
+              <w:top w:val="single" w:color="BFBFBF" w:sz="4"/>
+              <w:left w:val="single" w:color="BFBFBF" w:sz="4"/>
+              <w:bottom w:val="single" w:color="BFBFBF" w:sz="4"/>
+              <w:right w:val="single" w:color="BFBFBF" w:sz="4"/>
+            </w:tcBorders>
+            <w:tcMar>
+              <w:top w:type="dxa" w:w="60"/>
+              <w:left w:type="dxa" w:w="100"/>
+              <w:bottom w:type="dxa" w:w="60"/>
+              <w:right w:type="dxa" w:w="100"/>
+            </w:tcMar>
+          </w:tcPr>
+          <w:p>
+            <w:r>
+              <w:rPr>
+                <w:sz w:val="19"/>
+                <w:szCs w:val="19"/>
+              </w:rPr>
+              <w:t xml:space="preserve">Up to 60 submitted comments at a time, each with the student's first name and the same grades</w:t>
+            </w:r>
+          </w:p>
+        </w:tc>
+      </w:tr>
+    </w:tbl>
+    <w:p/>
+    <w:p>
+      <w:pPr>
+        <w:pStyle w:val="ListParagraph"/>
+        <w:numPr>
+          <w:ilvl w:val="0"/>
+          <w:numId w:val="2"/>
+        </w:numPr>
+      </w:pPr>
+      <w:r>
+        <w:rPr>
+          <w:b/>
+          <w:bCs/>
+        </w:rPr>
+        <w:t xml:space="preserve">Staff stay in control.</w:t>
+      </w:r>
+      <w:r>
+        <w:t xml:space="preserve"> A draft is only saved when the teacher saves or submits it, and a suggested fix is only applied if the checker clicks it.</w:t>
+      </w:r>
+    </w:p>
+    <w:p>
+      <w:pPr>
+        <w:pStyle w:val="ListParagraph"/>
+        <w:numPr>
+          <w:ilvl w:val="0"/>
+          <w:numId w:val="2"/>
+        </w:numPr>
+      </w:pPr>
+      <w:r>
+        <w:rPr>
+          <w:b/>
+          <w:bCs/>
+        </w:rPr>
+        <w:t xml:space="preserve">Minimal data leaves Formwork.</w:t>
+      </w:r>
+      <w:r>
+        <w:t xml:space="preserve"> Surnames, dates of birth, photos, medical, behaviour and contact details are never sent.</w:t>
+      </w:r>
+    </w:p>
+    <w:p>
+      <w:pPr>
+        <w:pStyle w:val="ListParagraph"/>
+        <w:numPr>
+          <w:ilvl w:val="0"/>
+          <w:numId w:val="2"/>
+        </w:numPr>
+      </w:pPr>
+      <w:r>
+        <w:rPr>
+          <w:b/>
+          <w:bCs/>
+        </w:rPr>
+        <w:t xml:space="preserve">The key stays private.</w:t>
+      </w:r>
+      <w:r>
+        <w:t xml:space="preserve"> Requests go from Formwork's server, so the API key is never visible in staff browsers.</w:t>
+      </w:r>
+    </w:p>
+    <w:p>
+      <w:pPr>
+        <w:pStyle w:val="ListParagraph"/>
+        <w:numPr>
+          <w:ilvl w:val="0"/>
+          <w:numId w:val="2"/>
+        </w:numPr>
+      </w:pPr>
+      <w:r>
+        <w:rPr>
+          <w:b/>
+          <w:bCs/>
+        </w:rPr>
+        <w:t xml:space="preserve">Nothing else depends on it.</w:t>
+      </w:r>
+      <w:r>
+        <w:t xml:space="preserve"> If the key is removed or the account runs out of credit, these two buttons stop working and the rest of Formwork carries on.</w:t>
+      </w:r>
+    </w:p>
+    <w:p>
+      <w:pPr>
+        <w:spacing w:after="160"/>
+      </w:pPr>
+      <w:r>
+        <w:t xml:space="preserve">The school should list the AI provider as a data processor in its NDPA records, since student first names and grades are sent to it.</w:t>
       </w:r>
     </w:p>
     <w:p>
@@ -4877,7 +5275,7 @@
               </w:rPr>
               <w:t xml:space="preserve">Free plan has no backups and pauses after 7 days with no activity. Pro adds daily backups kept for 7 days. </w:t>
             </w:r>
-            <w:hyperlink w:history="1" r:id="rIdkfqw02taenexiasxbwo0x">
+            <w:hyperlink w:history="1" r:id="rIdaybscitbsqrtubdtpqsle">
               <w:r>
                 <w:rPr>
                   <w:rStyle w:val="Hyperlink"/>
@@ -4996,7 +5394,7 @@
               </w:rPr>
               <w:t xml:space="preserve">The free Hobby plan is for personal, non-commercial use only; a school system needs Pro. </w:t>
             </w:r>
-            <w:hyperlink w:history="1" r:id="rId1kqevef6b5xv_18eigzxu">
+            <w:hyperlink w:history="1" r:id="rIdp7kccllhyyi3fqynjsuvt">
               <w:r>
                 <w:rPr>
                   <w:rStyle w:val="Hyperlink"/>
@@ -5123,7 +5521,7 @@
               </w:rPr>
               <w:t xml:space="preserve">Renewal prices vary widely by registrar; check the current registrar's renewal price. </w:t>
             </w:r>
-            <w:hyperlink w:history="1" r:id="rId4xny1brk9xopyupyrwctt">
+            <w:hyperlink w:history="1" r:id="rIdfrxj4r1xhedxex7ikyvuq">
               <w:r>
                 <w:rPr>
                   <w:rStyle w:val="Hyperlink"/>
@@ -5162,7 +5560,7 @@
                 <w:sz w:val="19"/>
                 <w:szCs w:val="19"/>
               </w:rPr>
-              <w:t xml:space="preserve">Anthropic API (report comments)</w:t>
+              <w:t xml:space="preserve">AI provider (report comments)</w:t>
             </w:r>
           </w:p>
         </w:tc>
@@ -5366,7 +5764,7 @@
               </w:rPr>
               <w:t xml:space="preserve">Only one mailbox is needed. </w:t>
             </w:r>
-            <w:hyperlink w:history="1" r:id="rIdpd-bdnwe5_oyyv0jsmozw">
+            <w:hyperlink w:history="1" r:id="rIdqyu6igh-dqdfkdlf026pf">
               <w:r>
                 <w:rPr>
                   <w:rStyle w:val="Hyperlink"/>
@@ -5683,18 +6081,7 @@
         </w:numPr>
       </w:pPr>
       <w:r>
-        <w:t xml:space="preserve">Set a new </w:t>
-      </w:r>
-      <w:r>
-        <w:rPr>
-          <w:rFonts w:ascii="Consolas" w:cs="Consolas" w:eastAsia="Consolas" w:hAnsi="Consolas"/>
-          <w:sz w:val="20"/>
-          <w:szCs w:val="20"/>
-        </w:rPr>
-        <w:t xml:space="preserve">ANTHROPIC_API_KEY</w:t>
-      </w:r>
-      <w:r>
-        <w:t xml:space="preserve"> in Vercel from a school account</w:t>
+        <w:t xml:space="preserve">Set a new AI provider API key in Vercel from a school account</w:t>
       </w:r>
     </w:p>
     <w:p>
@@ -5718,7 +6105,7 @@
         </w:numPr>
       </w:pPr>
       <w:r>
-        <w:t xml:space="preserve">Put a payment method on Supabase, Vercel, Anthropic and the domain</w:t>
+        <w:t xml:space="preserve">Put a payment method on Supabase, Vercel, the AI provider and the domain</w:t>
       </w:r>
     </w:p>
     <w:p>

</xml_diff>